<commit_message>
Identified features to be implemented in Phase1
</commit_message>
<xml_diff>
--- a/Software Requirements Specification.docx
+++ b/Software Requirements Specification.docx
@@ -126,8 +126,14 @@
           <w:ilvl w:val="0"/>
           <w:numId w:val="1"/>
         </w:numPr>
-      </w:pPr>
-      <w:r>
+        <w:rPr>
+          <w:color w:val="EE0000"/>
+        </w:rPr>
+      </w:pPr>
+      <w:r>
+        <w:rPr>
+          <w:color w:val="EE0000"/>
+        </w:rPr>
         <w:t>Dynamic fare calculation.</w:t>
       </w:r>
     </w:p>
@@ -159,8 +165,14 @@
           <w:ilvl w:val="0"/>
           <w:numId w:val="1"/>
         </w:numPr>
-      </w:pPr>
-      <w:r>
+        <w:rPr>
+          <w:color w:val="EE0000"/>
+        </w:rPr>
+      </w:pPr>
+      <w:r>
+        <w:rPr>
+          <w:color w:val="EE0000"/>
+        </w:rPr>
         <w:t>Commission deduction for the platform.</w:t>
       </w:r>
     </w:p>
@@ -170,8 +182,14 @@
           <w:ilvl w:val="0"/>
           <w:numId w:val="1"/>
         </w:numPr>
-      </w:pPr>
-      <w:r>
+        <w:rPr>
+          <w:color w:val="EE0000"/>
+        </w:rPr>
+      </w:pPr>
+      <w:r>
+        <w:rPr>
+          <w:color w:val="EE0000"/>
+        </w:rPr>
         <w:t>Ride history and reporting.</w:t>
       </w:r>
     </w:p>
@@ -218,8 +236,14 @@
           <w:ilvl w:val="0"/>
           <w:numId w:val="2"/>
         </w:numPr>
-      </w:pPr>
-      <w:r>
+        <w:rPr>
+          <w:color w:val="EE0000"/>
+        </w:rPr>
+      </w:pPr>
+      <w:r>
+        <w:rPr>
+          <w:color w:val="EE0000"/>
+        </w:rPr>
         <w:t>Platform Administrators</w:t>
       </w:r>
     </w:p>
@@ -229,8 +253,14 @@
           <w:ilvl w:val="0"/>
           <w:numId w:val="2"/>
         </w:numPr>
-      </w:pPr>
-      <w:r>
+        <w:rPr>
+          <w:color w:val="EE0000"/>
+        </w:rPr>
+      </w:pPr>
+      <w:r>
+        <w:rPr>
+          <w:color w:val="EE0000"/>
+        </w:rPr>
         <w:t>Customer Support Team</w:t>
       </w:r>
     </w:p>
@@ -240,8 +270,14 @@
           <w:ilvl w:val="0"/>
           <w:numId w:val="2"/>
         </w:numPr>
-      </w:pPr>
-      <w:r>
+        <w:rPr>
+          <w:color w:val="EE0000"/>
+        </w:rPr>
+      </w:pPr>
+      <w:r>
+        <w:rPr>
+          <w:color w:val="EE0000"/>
+        </w:rPr>
         <w:t>Finance Team</w:t>
       </w:r>
     </w:p>
@@ -251,15 +287,21 @@
           <w:ilvl w:val="0"/>
           <w:numId w:val="2"/>
         </w:numPr>
-      </w:pPr>
-      <w:r>
+        <w:rPr>
+          <w:color w:val="EE0000"/>
+        </w:rPr>
+      </w:pPr>
+      <w:r>
+        <w:rPr>
+          <w:color w:val="EE0000"/>
+        </w:rPr>
         <w:t>System Administrators</w:t>
       </w:r>
     </w:p>
     <w:p>
       <w:r>
         <w:pict w14:anchorId="47F9DF13">
-          <v:rect id="_x0000_i1163" style="width:0;height:1.5pt" o:hralign="center" o:hrstd="t" o:hr="t" fillcolor="#a0a0a0" stroked="f"/>
+          <v:rect id="_x0000_i1025" style="width:0;height:1.5pt" o:hralign="center" o:hrstd="t" o:hr="t" fillcolor="#a0a0a0" stroked="f"/>
         </w:pict>
       </w:r>
     </w:p>
@@ -337,8 +379,14 @@
           <w:ilvl w:val="0"/>
           <w:numId w:val="3"/>
         </w:numPr>
-      </w:pPr>
-      <w:r>
+        <w:rPr>
+          <w:color w:val="EE0000"/>
+        </w:rPr>
+      </w:pPr>
+      <w:r>
+        <w:rPr>
+          <w:color w:val="EE0000"/>
+        </w:rPr>
         <w:t>Make payments</w:t>
       </w:r>
     </w:p>
@@ -348,8 +396,14 @@
           <w:ilvl w:val="0"/>
           <w:numId w:val="3"/>
         </w:numPr>
-      </w:pPr>
-      <w:r>
+        <w:rPr>
+          <w:color w:val="EE0000"/>
+        </w:rPr>
+      </w:pPr>
+      <w:r>
+        <w:rPr>
+          <w:color w:val="EE0000"/>
+        </w:rPr>
         <w:t>Rate drivers</w:t>
       </w:r>
     </w:p>
@@ -396,8 +450,14 @@
           <w:ilvl w:val="0"/>
           <w:numId w:val="4"/>
         </w:numPr>
-      </w:pPr>
-      <w:r>
+        <w:rPr>
+          <w:color w:val="EE0000"/>
+        </w:rPr>
+      </w:pPr>
+      <w:r>
+        <w:rPr>
+          <w:color w:val="EE0000"/>
+        </w:rPr>
         <w:t>View earnings</w:t>
       </w:r>
     </w:p>
@@ -417,12 +477,14 @@
         <w:rPr>
           <w:b/>
           <w:bCs/>
-        </w:rPr>
-      </w:pPr>
-      <w:r>
-        <w:rPr>
-          <w:b/>
-          <w:bCs/>
+          <w:color w:val="EE0000"/>
+        </w:rPr>
+      </w:pPr>
+      <w:r>
+        <w:rPr>
+          <w:b/>
+          <w:bCs/>
+          <w:color w:val="EE0000"/>
         </w:rPr>
         <w:t>Administrator</w:t>
       </w:r>
@@ -433,8 +495,14 @@
           <w:ilvl w:val="0"/>
           <w:numId w:val="5"/>
         </w:numPr>
-      </w:pPr>
-      <w:r>
+        <w:rPr>
+          <w:color w:val="EE0000"/>
+        </w:rPr>
+      </w:pPr>
+      <w:r>
+        <w:rPr>
+          <w:color w:val="EE0000"/>
+        </w:rPr>
         <w:t>Manage users</w:t>
       </w:r>
     </w:p>
@@ -444,8 +512,14 @@
           <w:ilvl w:val="0"/>
           <w:numId w:val="5"/>
         </w:numPr>
-      </w:pPr>
-      <w:r>
+        <w:rPr>
+          <w:color w:val="EE0000"/>
+        </w:rPr>
+      </w:pPr>
+      <w:r>
+        <w:rPr>
+          <w:color w:val="EE0000"/>
+        </w:rPr>
         <w:t>Manage rides</w:t>
       </w:r>
     </w:p>
@@ -455,8 +529,14 @@
           <w:ilvl w:val="0"/>
           <w:numId w:val="5"/>
         </w:numPr>
-      </w:pPr>
-      <w:r>
+        <w:rPr>
+          <w:color w:val="EE0000"/>
+        </w:rPr>
+      </w:pPr>
+      <w:r>
+        <w:rPr>
+          <w:color w:val="EE0000"/>
+        </w:rPr>
         <w:t>Configure commissions</w:t>
       </w:r>
     </w:p>
@@ -466,8 +546,14 @@
           <w:ilvl w:val="0"/>
           <w:numId w:val="5"/>
         </w:numPr>
-      </w:pPr>
-      <w:r>
+        <w:rPr>
+          <w:color w:val="EE0000"/>
+        </w:rPr>
+      </w:pPr>
+      <w:r>
+        <w:rPr>
+          <w:color w:val="EE0000"/>
+        </w:rPr>
         <w:t>Generate reports</w:t>
       </w:r>
     </w:p>
@@ -477,15 +563,21 @@
           <w:ilvl w:val="0"/>
           <w:numId w:val="5"/>
         </w:numPr>
-      </w:pPr>
-      <w:r>
+        <w:rPr>
+          <w:color w:val="EE0000"/>
+        </w:rPr>
+      </w:pPr>
+      <w:r>
+        <w:rPr>
+          <w:color w:val="EE0000"/>
+        </w:rPr>
         <w:t>Resolve disputes</w:t>
       </w:r>
     </w:p>
     <w:p>
       <w:r>
         <w:pict w14:anchorId="57EFC0D4">
-          <v:rect id="_x0000_i1164" style="width:0;height:1.5pt" o:hralign="center" o:hrstd="t" o:hr="t" fillcolor="#a0a0a0" stroked="f"/>
+          <v:rect id="_x0000_i1026" style="width:0;height:1.5pt" o:hralign="center" o:hrstd="t" o:hr="t" fillcolor="#a0a0a0" stroked="f"/>
         </w:pict>
       </w:r>
     </w:p>
@@ -801,7 +893,7 @@
     <w:p>
       <w:r>
         <w:pict w14:anchorId="23C5788F">
-          <v:rect id="_x0000_i1165" style="width:0;height:1.5pt" o:hralign="center" o:hrstd="t" o:hr="t" fillcolor="#a0a0a0" stroked="f"/>
+          <v:rect id="_x0000_i1027" style="width:0;height:1.5pt" o:hralign="center" o:hrstd="t" o:hr="t" fillcolor="#a0a0a0" stroked="f"/>
         </w:pict>
       </w:r>
     </w:p>
@@ -920,7 +1012,7 @@
     <w:p>
       <w:r>
         <w:pict w14:anchorId="69AEBCDF">
-          <v:rect id="_x0000_i1166" style="width:0;height:1.5pt" o:hralign="center" o:hrstd="t" o:hr="t" fillcolor="#a0a0a0" stroked="f"/>
+          <v:rect id="_x0000_i1028" style="width:0;height:1.5pt" o:hralign="center" o:hrstd="t" o:hr="t" fillcolor="#a0a0a0" stroked="f"/>
         </w:pict>
       </w:r>
     </w:p>
@@ -1095,8 +1187,14 @@
           <w:ilvl w:val="0"/>
           <w:numId w:val="14"/>
         </w:numPr>
-      </w:pPr>
-      <w:r>
+        <w:rPr>
+          <w:color w:val="EE0000"/>
+        </w:rPr>
+      </w:pPr>
+      <w:r>
+        <w:rPr>
+          <w:color w:val="EE0000"/>
+        </w:rPr>
         <w:t>Multi-Factor Authentication (MFA)</w:t>
       </w:r>
     </w:p>
@@ -1195,7 +1293,7 @@
     <w:p>
       <w:r>
         <w:pict w14:anchorId="6F909651">
-          <v:rect id="_x0000_i1167" style="width:0;height:1.5pt" o:hralign="center" o:hrstd="t" o:hr="t" fillcolor="#a0a0a0" stroked="f"/>
+          <v:rect id="_x0000_i1029" style="width:0;height:1.5pt" o:hralign="center" o:hrstd="t" o:hr="t" fillcolor="#a0a0a0" stroked="f"/>
         </w:pict>
       </w:r>
     </w:p>
@@ -1338,8 +1436,14 @@
           <w:ilvl w:val="0"/>
           <w:numId w:val="17"/>
         </w:numPr>
-      </w:pPr>
-      <w:r>
+        <w:rPr>
+          <w:color w:val="EE0000"/>
+        </w:rPr>
+      </w:pPr>
+      <w:r>
+        <w:rPr>
+          <w:color w:val="EE0000"/>
+        </w:rPr>
         <w:t>Vehicle Insurance</w:t>
       </w:r>
     </w:p>
@@ -1349,15 +1453,21 @@
           <w:ilvl w:val="0"/>
           <w:numId w:val="17"/>
         </w:numPr>
-      </w:pPr>
-      <w:r>
+        <w:rPr>
+          <w:color w:val="EE0000"/>
+        </w:rPr>
+      </w:pPr>
+      <w:r>
+        <w:rPr>
+          <w:color w:val="EE0000"/>
+        </w:rPr>
         <w:t>Background Verification Status</w:t>
       </w:r>
     </w:p>
     <w:p>
       <w:r>
         <w:pict w14:anchorId="18E3A36E">
-          <v:rect id="_x0000_i1168" style="width:0;height:1.5pt" o:hralign="center" o:hrstd="t" o:hr="t" fillcolor="#a0a0a0" stroked="f"/>
+          <v:rect id="_x0000_i1030" style="width:0;height:1.5pt" o:hralign="center" o:hrstd="t" o:hr="t" fillcolor="#a0a0a0" stroked="f"/>
         </w:pict>
       </w:r>
     </w:p>
@@ -1581,7 +1691,7 @@
     <w:p>
       <w:r>
         <w:pict w14:anchorId="70016C21">
-          <v:rect id="_x0000_i1169" style="width:0;height:1.5pt" o:hralign="center" o:hrstd="t" o:hr="t" fillcolor="#a0a0a0" stroked="f"/>
+          <v:rect id="_x0000_i1031" style="width:0;height:1.5pt" o:hralign="center" o:hrstd="t" o:hr="t" fillcolor="#a0a0a0" stroked="f"/>
         </w:pict>
       </w:r>
     </w:p>
@@ -1726,7 +1836,7 @@
     <w:p>
       <w:r>
         <w:pict w14:anchorId="019E1E89">
-          <v:rect id="_x0000_i1170" style="width:0;height:1.5pt" o:hralign="center" o:hrstd="t" o:hr="t" fillcolor="#a0a0a0" stroked="f"/>
+          <v:rect id="_x0000_i1032" style="width:0;height:1.5pt" o:hralign="center" o:hrstd="t" o:hr="t" fillcolor="#a0a0a0" stroked="f"/>
         </w:pict>
       </w:r>
     </w:p>
@@ -1799,8 +1909,14 @@
           <w:ilvl w:val="0"/>
           <w:numId w:val="23"/>
         </w:numPr>
-      </w:pPr>
-      <w:r>
+        <w:rPr>
+          <w:color w:val="C00000"/>
+        </w:rPr>
+      </w:pPr>
+      <w:r>
+        <w:rPr>
+          <w:color w:val="C00000"/>
+        </w:rPr>
         <w:t>Make Payment</w:t>
       </w:r>
     </w:p>
@@ -1915,7 +2031,7 @@
     <w:p>
       <w:r>
         <w:pict w14:anchorId="2A061AA7">
-          <v:rect id="_x0000_i1171" style="width:0;height:1.5pt" o:hralign="center" o:hrstd="t" o:hr="t" fillcolor="#a0a0a0" stroked="f"/>
+          <v:rect id="_x0000_i1033" style="width:0;height:1.5pt" o:hralign="center" o:hrstd="t" o:hr="t" fillcolor="#a0a0a0" stroked="f"/>
         </w:pict>
       </w:r>
     </w:p>
@@ -1966,8 +2082,14 @@
           <w:ilvl w:val="0"/>
           <w:numId w:val="26"/>
         </w:numPr>
-      </w:pPr>
-      <w:r>
+        <w:rPr>
+          <w:color w:val="C00000"/>
+        </w:rPr>
+      </w:pPr>
+      <w:r>
+        <w:rPr>
+          <w:color w:val="C00000"/>
+        </w:rPr>
         <w:t>Cancellation fee configurable.</w:t>
       </w:r>
     </w:p>
@@ -2011,7 +2133,7 @@
     <w:p>
       <w:r>
         <w:pict w14:anchorId="47394AF1">
-          <v:rect id="_x0000_i1172" style="width:0;height:1.5pt" o:hralign="center" o:hrstd="t" o:hr="t" fillcolor="#a0a0a0" stroked="f"/>
+          <v:rect id="_x0000_i1034" style="width:0;height:1.5pt" o:hralign="center" o:hrstd="t" o:hr="t" fillcolor="#a0a0a0" stroked="f"/>
         </w:pict>
       </w:r>
     </w:p>
@@ -2162,7 +2284,7 @@
     <w:p>
       <w:r>
         <w:pict w14:anchorId="7BFCCF75">
-          <v:rect id="_x0000_i1173" style="width:0;height:1.5pt" o:hralign="center" o:hrstd="t" o:hr="t" fillcolor="#a0a0a0" stroked="f"/>
+          <v:rect id="_x0000_i1035" style="width:0;height:1.5pt" o:hralign="center" o:hrstd="t" o:hr="t" fillcolor="#a0a0a0" stroked="f"/>
         </w:pict>
       </w:r>
     </w:p>
@@ -2171,14 +2293,24 @@
         <w:rPr>
           <w:b/>
           <w:bCs/>
-        </w:rPr>
-      </w:pPr>
-      <w:r>
-        <w:rPr>
-          <w:b/>
-          <w:bCs/>
+          <w:color w:val="00B0F0"/>
+        </w:rPr>
+      </w:pPr>
+      <w:r>
+        <w:rPr>
+          <w:b/>
+          <w:bCs/>
+          <w:color w:val="00B0F0"/>
         </w:rPr>
         <w:t>4.6 Rate Calculation</w:t>
+      </w:r>
+      <w:r>
+        <w:rPr>
+          <w:b/>
+          <w:bCs/>
+          <w:color w:val="00B0F0"/>
+        </w:rPr>
+        <w:t xml:space="preserve">   -- If time permits, we can include in phase 1</w:t>
       </w:r>
     </w:p>
     <w:p>
@@ -2443,7 +2575,7 @@
     <w:p>
       <w:r>
         <w:pict w14:anchorId="2CAFC42D">
-          <v:rect id="_x0000_i1174" style="width:0;height:1.5pt" o:hralign="center" o:hrstd="t" o:hr="t" fillcolor="#a0a0a0" stroked="f"/>
+          <v:rect id="_x0000_i1036" style="width:0;height:1.5pt" o:hralign="center" o:hrstd="t" o:hr="t" fillcolor="#a0a0a0" stroked="f"/>
         </w:pict>
       </w:r>
     </w:p>
@@ -2467,12 +2599,14 @@
         <w:rPr>
           <w:b/>
           <w:bCs/>
-        </w:rPr>
-      </w:pPr>
-      <w:r>
-        <w:rPr>
-          <w:b/>
-          <w:bCs/>
+          <w:color w:val="C00000"/>
+        </w:rPr>
+      </w:pPr>
+      <w:r>
+        <w:rPr>
+          <w:b/>
+          <w:bCs/>
+          <w:color w:val="C00000"/>
         </w:rPr>
         <w:t xml:space="preserve">5.1 Pay </w:t>
       </w:r>
@@ -2481,6 +2615,7 @@
         <w:rPr>
           <w:b/>
           <w:bCs/>
+          <w:color w:val="C00000"/>
         </w:rPr>
         <w:t>For</w:t>
       </w:r>
@@ -2489,6 +2624,7 @@
         <w:rPr>
           <w:b/>
           <w:bCs/>
+          <w:color w:val="C00000"/>
         </w:rPr>
         <w:t xml:space="preserve"> Ride</w:t>
       </w:r>
@@ -2718,7 +2854,7 @@
     <w:p>
       <w:r>
         <w:pict w14:anchorId="6E05B1CF">
-          <v:rect id="_x0000_i1175" style="width:0;height:1.5pt" o:hralign="center" o:hrstd="t" o:hr="t" fillcolor="#a0a0a0" stroked="f"/>
+          <v:rect id="_x0000_i1037" style="width:0;height:1.5pt" o:hralign="center" o:hrstd="t" o:hr="t" fillcolor="#a0a0a0" stroked="f"/>
         </w:pict>
       </w:r>
     </w:p>
@@ -2727,12 +2863,14 @@
         <w:rPr>
           <w:b/>
           <w:bCs/>
-        </w:rPr>
-      </w:pPr>
-      <w:r>
-        <w:rPr>
-          <w:b/>
-          <w:bCs/>
+          <w:color w:val="C00000"/>
+        </w:rPr>
+      </w:pPr>
+      <w:r>
+        <w:rPr>
+          <w:b/>
+          <w:bCs/>
+          <w:color w:val="C00000"/>
         </w:rPr>
         <w:t>5.2 Organization Commission</w:t>
       </w:r>
@@ -2893,7 +3031,7 @@
     <w:p>
       <w:r>
         <w:pict w14:anchorId="6B834CA1">
-          <v:rect id="_x0000_i1176" style="width:0;height:1.5pt" o:hralign="center" o:hrstd="t" o:hr="t" fillcolor="#a0a0a0" stroked="f"/>
+          <v:rect id="_x0000_i1038" style="width:0;height:1.5pt" o:hralign="center" o:hrstd="t" o:hr="t" fillcolor="#a0a0a0" stroked="f"/>
         </w:pict>
       </w:r>
     </w:p>
@@ -2902,12 +3040,14 @@
         <w:rPr>
           <w:b/>
           <w:bCs/>
-        </w:rPr>
-      </w:pPr>
-      <w:r>
-        <w:rPr>
-          <w:b/>
-          <w:bCs/>
+          <w:color w:val="C00000"/>
+        </w:rPr>
+      </w:pPr>
+      <w:r>
+        <w:rPr>
+          <w:b/>
+          <w:bCs/>
+          <w:color w:val="C00000"/>
         </w:rPr>
         <w:t>5.3 Refund Processing</w:t>
       </w:r>
@@ -3021,7 +3161,7 @@
     <w:p>
       <w:r>
         <w:pict w14:anchorId="271FB533">
-          <v:rect id="_x0000_i1177" style="width:0;height:1.5pt" o:hralign="center" o:hrstd="t" o:hr="t" fillcolor="#a0a0a0" stroked="f"/>
+          <v:rect id="_x0000_i1039" style="width:0;height:1.5pt" o:hralign="center" o:hrstd="t" o:hr="t" fillcolor="#a0a0a0" stroked="f"/>
         </w:pict>
       </w:r>
     </w:p>
@@ -3030,12 +3170,14 @@
         <w:rPr>
           <w:b/>
           <w:bCs/>
-        </w:rPr>
-      </w:pPr>
-      <w:r>
-        <w:rPr>
-          <w:b/>
-          <w:bCs/>
+          <w:color w:val="C00000"/>
+        </w:rPr>
+      </w:pPr>
+      <w:r>
+        <w:rPr>
+          <w:b/>
+          <w:bCs/>
+          <w:color w:val="C00000"/>
         </w:rPr>
         <w:t>Module 4: Rating &amp; Reviews</w:t>
       </w:r>
@@ -3177,7 +3319,7 @@
     <w:p>
       <w:r>
         <w:pict w14:anchorId="067730FC">
-          <v:rect id="_x0000_i1178" style="width:0;height:1.5pt" o:hralign="center" o:hrstd="t" o:hr="t" fillcolor="#a0a0a0" stroked="f"/>
+          <v:rect id="_x0000_i1040" style="width:0;height:1.5pt" o:hralign="center" o:hrstd="t" o:hr="t" fillcolor="#a0a0a0" stroked="f"/>
         </w:pict>
       </w:r>
     </w:p>
@@ -3264,7 +3406,7 @@
     <w:p>
       <w:r>
         <w:pict w14:anchorId="259EE3A7">
-          <v:rect id="_x0000_i1179" style="width:0;height:1.5pt" o:hralign="center" o:hrstd="t" o:hr="t" fillcolor="#a0a0a0" stroked="f"/>
+          <v:rect id="_x0000_i1041" style="width:0;height:1.5pt" o:hralign="center" o:hrstd="t" o:hr="t" fillcolor="#a0a0a0" stroked="f"/>
         </w:pict>
       </w:r>
     </w:p>
@@ -3350,7 +3492,7 @@
     <w:p>
       <w:r>
         <w:pict w14:anchorId="5B9048AB">
-          <v:rect id="_x0000_i1180" style="width:0;height:1.5pt" o:hralign="center" o:hrstd="t" o:hr="t" fillcolor="#a0a0a0" stroked="f"/>
+          <v:rect id="_x0000_i1042" style="width:0;height:1.5pt" o:hralign="center" o:hrstd="t" o:hr="t" fillcolor="#a0a0a0" stroked="f"/>
         </w:pict>
       </w:r>
     </w:p>
@@ -3421,7 +3563,7 @@
     <w:p>
       <w:r>
         <w:pict w14:anchorId="4940C181">
-          <v:rect id="_x0000_i1181" style="width:0;height:1.5pt" o:hralign="center" o:hrstd="t" o:hr="t" fillcolor="#a0a0a0" stroked="f"/>
+          <v:rect id="_x0000_i1043" style="width:0;height:1.5pt" o:hralign="center" o:hrstd="t" o:hr="t" fillcolor="#a0a0a0" stroked="f"/>
         </w:pict>
       </w:r>
     </w:p>
@@ -3481,7 +3623,7 @@
     <w:p>
       <w:r>
         <w:pict w14:anchorId="544C5598">
-          <v:rect id="_x0000_i1182" style="width:0;height:1.5pt" o:hralign="center" o:hrstd="t" o:hr="t" fillcolor="#a0a0a0" stroked="f"/>
+          <v:rect id="_x0000_i1044" style="width:0;height:1.5pt" o:hralign="center" o:hrstd="t" o:hr="t" fillcolor="#a0a0a0" stroked="f"/>
         </w:pict>
       </w:r>
     </w:p>
@@ -3664,7 +3806,7 @@
     <w:p>
       <w:r>
         <w:pict w14:anchorId="0F7C78FF">
-          <v:rect id="_x0000_i1183" style="width:0;height:1.5pt" o:hralign="center" o:hrstd="t" o:hr="t" fillcolor="#a0a0a0" stroked="f"/>
+          <v:rect id="_x0000_i1045" style="width:0;height:1.5pt" o:hralign="center" o:hrstd="t" o:hr="t" fillcolor="#a0a0a0" stroked="f"/>
         </w:pict>
       </w:r>
     </w:p>
@@ -3910,7 +4052,7 @@
     <w:p>
       <w:r>
         <w:pict w14:anchorId="353A7AC5">
-          <v:rect id="_x0000_i1184" style="width:0;height:1.5pt" o:hralign="center" o:hrstd="t" o:hr="t" fillcolor="#a0a0a0" stroked="f"/>
+          <v:rect id="_x0000_i1046" style="width:0;height:1.5pt" o:hralign="center" o:hrstd="t" o:hr="t" fillcolor="#a0a0a0" stroked="f"/>
         </w:pict>
       </w:r>
     </w:p>
@@ -4168,7 +4310,7 @@
     <w:p>
       <w:r>
         <w:pict w14:anchorId="1F84B0E2">
-          <v:rect id="_x0000_i1185" style="width:0;height:1.5pt" o:hralign="center" o:hrstd="t" o:hr="t" fillcolor="#a0a0a0" stroked="f"/>
+          <v:rect id="_x0000_i1047" style="width:0;height:1.5pt" o:hralign="center" o:hrstd="t" o:hr="t" fillcolor="#a0a0a0" stroked="f"/>
         </w:pict>
       </w:r>
     </w:p>
@@ -13372,6 +13514,7 @@
   <w:style w:type="character" w:default="1" w:styleId="DefaultParagraphFont">
     <w:name w:val="Default Paragraph Font"/>
     <w:uiPriority w:val="1"/>
+    <w:semiHidden/>
     <w:unhideWhenUsed/>
   </w:style>
   <w:style w:type="table" w:default="1" w:styleId="TableNormal">

</xml_diff>